<commit_message>
docs: update GA_GATE_CHECKLIST — G-S11 32 proofs PASS, 41/46 total
GA Gate result: CONDITIONAL PASS (41/46)
- G-S11 proof_count: 32 proofs ✅
- G-S16 static_analysis: Miri available ✅
- G-S18 oo_docs: 17/17 files ✅
- G-S19 information_schema: 8 tests ✅
- 3 items SKIP (server-only: G6/G9/G-S9/G-S15)
</commit_message>
<xml_diff>
--- a/docs/教学计划/PPT/第10讲-PR工作流与项目成熟度评估-v5.docx
+++ b/docs/教学计划/PPT/第10讲-PR工作流与项目成熟度评估-v5.docx
@@ -21,14 +21,35 @@
         <w:p>
           <w:r>
             <w:fldChar w:fldCharType="begin" w:dirty="true"/>
-            <w:instrText xml:space="preserve">TOC \o "1-3" \h \z \u</w:instrText>
+            <w:instrText xml:space="preserve">TOC \o "1-2" \h \z \u</w:instrText>
             <w:fldChar w:fldCharType="separate"/>
             <w:fldChar w:fldCharType="end"/>
           </w:r>
         </w:p>
       </w:sdtContent>
     </w:sdt>
-    <w:bookmarkStart w:id="9" w:name="课程大纲"/>
+    <w:p>
+      <w:pPr>
+        <w:pStyle w:val="Heading1"/>
+      </w:pPr>
+      <w:r>
+        <w:rPr>
+          <w:rFonts w:hint="eastAsia"/>
+        </w:rPr>
+        <w:t xml:space="preserve">第十讲：PR工作流与项目成熟度评估</w:t>
+      </w:r>
+    </w:p>
+    <w:p>
+      <w:pPr>
+        <w:pStyle w:val="Heading2"/>
+      </w:pPr>
+      <w:r>
+        <w:rPr>
+          <w:rFonts w:hint="eastAsia"/>
+        </w:rPr>
+        <w:t xml:space="preserve">AI增强的软件工程</w:t>
+      </w:r>
+    </w:p>
     <w:p>
       <w:pPr>
         <w:pStyle w:val="Heading1"/>
@@ -133,15 +154,6 @@
       </w:r>
     </w:p>
     <w:p>
-      <w:r>
-        <w:pict>
-          <v:rect style="width:0;height:1.5pt" o:hralign="center" o:hrstd="t" o:hr="t"/>
-        </w:pict>
-      </w:r>
-    </w:p>
-    <w:bookmarkEnd w:id="9"/>
-    <w:bookmarkStart w:id="23" w:name="part-1-pr工作流详解"/>
-    <w:p>
       <w:pPr>
         <w:pStyle w:val="Heading1"/>
       </w:pPr>
@@ -156,14 +168,6 @@
       </w:r>
     </w:p>
     <w:p>
-      <w:r>
-        <w:pict>
-          <v:rect style="width:0;height:1.5pt" o:hralign="center" o:hrstd="t" o:hr="t"/>
-        </w:pict>
-      </w:r>
-    </w:p>
-    <w:bookmarkStart w:id="12" w:name="what什么是pr工作流"/>
-    <w:p>
       <w:pPr>
         <w:pStyle w:val="Heading2"/>
       </w:pPr>
@@ -177,7 +181,6 @@
         <w:t xml:space="preserve">What：什么是PR工作流</w:t>
       </w:r>
     </w:p>
-    <w:bookmarkStart w:id="10" w:name="pull-request定义"/>
     <w:p>
       <w:pPr>
         <w:pStyle w:val="Heading3"/>
@@ -203,8 +206,6 @@
         <w:t xml:space="preserve">一种代码合并请求机制，用于代码审核和讨论</w:t>
       </w:r>
     </w:p>
-    <w:bookmarkEnd w:id="10"/>
-    <w:bookmarkStart w:id="11" w:name="pr工作流的作用"/>
     <w:p>
       <w:pPr>
         <w:pStyle w:val="Heading3"/>
@@ -309,16 +310,6 @@
       </w:r>
     </w:p>
     <w:p>
-      <w:r>
-        <w:pict>
-          <v:rect style="width:0;height:1.5pt" o:hralign="center" o:hrstd="t" o:hr="t"/>
-        </w:pict>
-      </w:r>
-    </w:p>
-    <w:bookmarkEnd w:id="11"/>
-    <w:bookmarkEnd w:id="12"/>
-    <w:bookmarkStart w:id="16" w:name="why为什么使用pr工作流"/>
-    <w:p>
       <w:pPr>
         <w:pStyle w:val="Heading2"/>
       </w:pPr>
@@ -332,7 +323,6 @@
         <w:t xml:space="preserve">Why：为什么使用PR工作流</w:t>
       </w:r>
     </w:p>
-    <w:bookmarkStart w:id="13" w:name="质量保证"/>
     <w:p>
       <w:pPr>
         <w:pStyle w:val="Heading3"/>
@@ -389,8 +379,6 @@
         <w:t xml:space="preserve">保证代码规范</w:t>
       </w:r>
     </w:p>
-    <w:bookmarkEnd w:id="13"/>
-    <w:bookmarkStart w:id="14" w:name="知识传递"/>
     <w:p>
       <w:pPr>
         <w:pStyle w:val="Heading3"/>
@@ -447,8 +435,6 @@
         <w:t xml:space="preserve">新成员快速上手</w:t>
       </w:r>
     </w:p>
-    <w:bookmarkEnd w:id="14"/>
-    <w:bookmarkStart w:id="15" w:name="协作效率"/>
     <w:p>
       <w:pPr>
         <w:pStyle w:val="Heading3"/>
@@ -506,16 +492,6 @@
       </w:r>
     </w:p>
     <w:p>
-      <w:r>
-        <w:pict>
-          <v:rect style="width:0;height:1.5pt" o:hralign="center" o:hrstd="t" o:hr="t"/>
-        </w:pict>
-      </w:r>
-    </w:p>
-    <w:bookmarkEnd w:id="15"/>
-    <w:bookmarkEnd w:id="16"/>
-    <w:bookmarkStart w:id="18" w:name="howpr工作流最佳实践"/>
-    <w:p>
       <w:pPr>
         <w:pStyle w:val="Heading2"/>
       </w:pPr>
@@ -529,7 +505,6 @@
         <w:t xml:space="preserve">How：PR工作流最佳实践</w:t>
       </w:r>
     </w:p>
-    <w:bookmarkStart w:id="17" w:name="创建pr"/>
     <w:p>
       <w:pPr>
         <w:pStyle w:val="Heading3"/>
@@ -718,16 +693,6 @@
       </w:r>
     </w:p>
     <w:p>
-      <w:r>
-        <w:pict>
-          <v:rect style="width:0;height:1.5pt" o:hralign="center" o:hrstd="t" o:hr="t"/>
-        </w:pict>
-      </w:r>
-    </w:p>
-    <w:bookmarkEnd w:id="17"/>
-    <w:bookmarkEnd w:id="18"/>
-    <w:bookmarkStart w:id="20" w:name="howpr工作流最佳实践续"/>
-    <w:p>
       <w:pPr>
         <w:pStyle w:val="Heading2"/>
       </w:pPr>
@@ -741,7 +706,6 @@
         <w:t xml:space="preserve">How：PR工作流最佳实践（续）</w:t>
       </w:r>
     </w:p>
-    <w:bookmarkStart w:id="19" w:name="审核pr"/>
     <w:p>
       <w:pPr>
         <w:pStyle w:val="Heading3"/>
@@ -960,16 +924,6 @@
       </w:r>
     </w:p>
     <w:p>
-      <w:r>
-        <w:pict>
-          <v:rect style="width:0;height:1.5pt" o:hralign="center" o:hrstd="t" o:hr="t"/>
-        </w:pict>
-      </w:r>
-    </w:p>
-    <w:bookmarkEnd w:id="19"/>
-    <w:bookmarkEnd w:id="20"/>
-    <w:bookmarkStart w:id="22" w:name="howpr工作流最佳实践续-1"/>
-    <w:p>
       <w:pPr>
         <w:pStyle w:val="Heading2"/>
       </w:pPr>
@@ -983,7 +937,6 @@
         <w:t xml:space="preserve">How：PR工作流最佳实践（续）</w:t>
       </w:r>
     </w:p>
-    <w:bookmarkStart w:id="21" w:name="合并pr"/>
     <w:p>
       <w:pPr>
         <w:pStyle w:val="Heading3"/>
@@ -1148,17 +1101,6 @@
       </w:r>
     </w:p>
     <w:p>
-      <w:r>
-        <w:pict>
-          <v:rect style="width:0;height:1.5pt" o:hralign="center" o:hrstd="t" o:hr="t"/>
-        </w:pict>
-      </w:r>
-    </w:p>
-    <w:bookmarkEnd w:id="21"/>
-    <w:bookmarkEnd w:id="22"/>
-    <w:bookmarkEnd w:id="23"/>
-    <w:bookmarkStart w:id="36" w:name="part-2-项目成熟度评估"/>
-    <w:p>
       <w:pPr>
         <w:pStyle w:val="Heading1"/>
       </w:pPr>
@@ -1173,14 +1115,6 @@
       </w:r>
     </w:p>
     <w:p>
-      <w:r>
-        <w:pict>
-          <v:rect style="width:0;height:1.5pt" o:hralign="center" o:hrstd="t" o:hr="t"/>
-        </w:pict>
-      </w:r>
-    </w:p>
-    <w:bookmarkStart w:id="26" w:name="what什么是项目成熟度"/>
-    <w:p>
       <w:pPr>
         <w:pStyle w:val="Heading2"/>
       </w:pPr>
@@ -1194,7 +1128,6 @@
         <w:t xml:space="preserve">What：什么是项目成熟度</w:t>
       </w:r>
     </w:p>
-    <w:bookmarkStart w:id="24" w:name="定义"/>
     <w:p>
       <w:pPr>
         <w:pStyle w:val="Heading3"/>
@@ -1217,8 +1150,6 @@
         <w:t xml:space="preserve">项目在功能完整性、代码质量、文档完善度等方面的综合评估</w:t>
       </w:r>
     </w:p>
-    <w:bookmarkEnd w:id="24"/>
-    <w:bookmarkStart w:id="25" w:name="成熟度等级"/>
     <w:p>
       <w:pPr>
         <w:pStyle w:val="Heading3"/>
@@ -1486,16 +1417,6 @@
       </w:tr>
     </w:tbl>
     <w:p>
-      <w:r>
-        <w:pict>
-          <v:rect style="width:0;height:1.5pt" o:hralign="center" o:hrstd="t" o:hr="t"/>
-        </w:pict>
-      </w:r>
-    </w:p>
-    <w:bookmarkEnd w:id="25"/>
-    <w:bookmarkEnd w:id="26"/>
-    <w:bookmarkStart w:id="30" w:name="why为什么需要成熟度评估"/>
-    <w:p>
       <w:pPr>
         <w:pStyle w:val="Heading2"/>
       </w:pPr>
@@ -1509,7 +1430,6 @@
         <w:t xml:space="preserve">Why：为什么需要成熟度评估</w:t>
       </w:r>
     </w:p>
-    <w:bookmarkStart w:id="27" w:name="项目管理"/>
     <w:p>
       <w:pPr>
         <w:pStyle w:val="Heading3"/>
@@ -1566,8 +1486,6 @@
         <w:t xml:space="preserve">分配资源</w:t>
       </w:r>
     </w:p>
-    <w:bookmarkEnd w:id="27"/>
-    <w:bookmarkStart w:id="28" w:name="质量控制"/>
     <w:p>
       <w:pPr>
         <w:pStyle w:val="Heading3"/>
@@ -1624,8 +1542,6 @@
         <w:t xml:space="preserve">持续改进</w:t>
       </w:r>
     </w:p>
-    <w:bookmarkEnd w:id="28"/>
-    <w:bookmarkStart w:id="29" w:name="沟通协作"/>
     <w:p>
       <w:pPr>
         <w:pStyle w:val="Heading3"/>
@@ -1683,16 +1599,6 @@
       </w:r>
     </w:p>
     <w:p>
-      <w:r>
-        <w:pict>
-          <v:rect style="width:0;height:1.5pt" o:hralign="center" o:hrstd="t" o:hr="t"/>
-        </w:pict>
-      </w:r>
-    </w:p>
-    <w:bookmarkEnd w:id="29"/>
-    <w:bookmarkEnd w:id="30"/>
-    <w:bookmarkStart w:id="32" w:name="howv2.0成熟度评估"/>
-    <w:p>
       <w:pPr>
         <w:pStyle w:val="Heading2"/>
       </w:pPr>
@@ -1706,7 +1612,6 @@
         <w:t xml:space="preserve">How：v2.0成熟度评估</w:t>
       </w:r>
     </w:p>
-    <w:bookmarkStart w:id="31" w:name="评估维度"/>
     <w:p>
       <w:pPr>
         <w:pStyle w:val="Heading3"/>
@@ -2050,16 +1955,6 @@
       </w:tr>
     </w:tbl>
     <w:p>
-      <w:r>
-        <w:pict>
-          <v:rect style="width:0;height:1.5pt" o:hralign="center" o:hrstd="t" o:hr="t"/>
-        </w:pict>
-      </w:r>
-    </w:p>
-    <w:bookmarkEnd w:id="31"/>
-    <w:bookmarkEnd w:id="32"/>
-    <w:bookmarkStart w:id="35" w:name="howv2.0成熟度评估续"/>
-    <w:p>
       <w:pPr>
         <w:pStyle w:val="Heading2"/>
       </w:pPr>
@@ -2073,7 +1968,6 @@
         <w:t xml:space="preserve">How：v2.0成熟度评估（续）</w:t>
       </w:r>
     </w:p>
-    <w:bookmarkStart w:id="33" w:name="评估结果"/>
     <w:p>
       <w:pPr>
         <w:pStyle w:val="Heading3"/>
@@ -2342,8 +2236,6 @@
         <w:t xml:space="preserve">└─────────────────────────────────────────────────────┘</w:t>
       </w:r>
     </w:p>
-    <w:bookmarkEnd w:id="33"/>
-    <w:bookmarkStart w:id="34" w:name="改进计划"/>
     <w:p>
       <w:pPr>
         <w:pStyle w:val="Heading3"/>
@@ -2401,17 +2293,6 @@
       </w:r>
     </w:p>
     <w:p>
-      <w:r>
-        <w:pict>
-          <v:rect style="width:0;height:1.5pt" o:hralign="center" o:hrstd="t" o:hr="t"/>
-        </w:pict>
-      </w:r>
-    </w:p>
-    <w:bookmarkEnd w:id="34"/>
-    <w:bookmarkEnd w:id="35"/>
-    <w:bookmarkEnd w:id="36"/>
-    <w:bookmarkStart w:id="48" w:name="part-3-v2.0功能规划"/>
-    <w:p>
       <w:pPr>
         <w:pStyle w:val="Heading1"/>
       </w:pPr>
@@ -2426,14 +2307,6 @@
       </w:r>
     </w:p>
     <w:p>
-      <w:r>
-        <w:pict>
-          <v:rect style="width:0;height:1.5pt" o:hralign="center" o:hrstd="t" o:hr="t"/>
-        </w:pict>
-      </w:r>
-    </w:p>
-    <w:bookmarkStart w:id="40" w:name="whatv2.0新功能当前开发中"/>
-    <w:p>
       <w:pPr>
         <w:pStyle w:val="Heading2"/>
       </w:pPr>
@@ -2447,7 +2320,6 @@
         <w:t xml:space="preserve">What：v2.0新功能（当前开发中）</w:t>
       </w:r>
     </w:p>
-    <w:bookmarkStart w:id="37" w:name="join支持"/>
     <w:p>
       <w:pPr>
         <w:pStyle w:val="Heading3"/>
@@ -2507,8 +2379,6 @@
         <w:t xml:space="preserve">FULL OUTER JOIN</w:t>
       </w:r>
     </w:p>
-    <w:bookmarkEnd w:id="37"/>
-    <w:bookmarkStart w:id="38" w:name="子查询支持"/>
     <w:p>
       <w:pPr>
         <w:pStyle w:val="Heading3"/>
@@ -2565,8 +2435,6 @@
         <w:t xml:space="preserve">SELECT子句子查询</w:t>
       </w:r>
     </w:p>
-    <w:bookmarkEnd w:id="38"/>
-    <w:bookmarkStart w:id="39" w:name="视图支持"/>
     <w:p>
       <w:pPr>
         <w:pStyle w:val="Heading3"/>
@@ -2618,16 +2486,6 @@
       </w:r>
     </w:p>
     <w:p>
-      <w:r>
-        <w:pict>
-          <v:rect style="width:0;height:1.5pt" o:hralign="center" o:hrstd="t" o:hr="t"/>
-        </w:pict>
-      </w:r>
-    </w:p>
-    <w:bookmarkEnd w:id="39"/>
-    <w:bookmarkEnd w:id="40"/>
-    <w:bookmarkStart w:id="44" w:name="why为什么需要这些功能"/>
-    <w:p>
       <w:pPr>
         <w:pStyle w:val="Heading2"/>
       </w:pPr>
@@ -2641,7 +2499,6 @@
         <w:t xml:space="preserve">Why：为什么需要这些功能</w:t>
       </w:r>
     </w:p>
-    <w:bookmarkStart w:id="41" w:name="join支持-1"/>
     <w:p>
       <w:pPr>
         <w:pStyle w:val="Heading3"/>
@@ -2698,8 +2555,6 @@
         <w:t xml:space="preserve">提高数据关联能力</w:t>
       </w:r>
     </w:p>
-    <w:bookmarkEnd w:id="41"/>
-    <w:bookmarkStart w:id="42" w:name="子查询支持-1"/>
     <w:p>
       <w:pPr>
         <w:pStyle w:val="Heading3"/>
@@ -2756,8 +2611,6 @@
         <w:t xml:space="preserve">支持嵌套查询</w:t>
       </w:r>
     </w:p>
-    <w:bookmarkEnd w:id="42"/>
-    <w:bookmarkStart w:id="43" w:name="视图支持-1"/>
     <w:p>
       <w:pPr>
         <w:pStyle w:val="Heading3"/>
@@ -2815,16 +2668,6 @@
       </w:r>
     </w:p>
     <w:p>
-      <w:r>
-        <w:pict>
-          <v:rect style="width:0;height:1.5pt" o:hralign="center" o:hrstd="t" o:hr="t"/>
-        </w:pict>
-      </w:r>
-    </w:p>
-    <w:bookmarkEnd w:id="43"/>
-    <w:bookmarkEnd w:id="44"/>
-    <w:bookmarkStart w:id="47" w:name="howv2.0实现计划"/>
-    <w:p>
       <w:pPr>
         <w:pStyle w:val="Heading2"/>
       </w:pPr>
@@ -2838,7 +2681,6 @@
         <w:t xml:space="preserve">How：v2.0实现计划</w:t>
       </w:r>
     </w:p>
-    <w:bookmarkStart w:id="45" w:name="开发周期"/>
     <w:p>
       <w:pPr>
         <w:pStyle w:val="Heading3"/>
@@ -3032,8 +2874,6 @@
         </w:tc>
       </w:tr>
     </w:tbl>
-    <w:bookmarkEnd w:id="45"/>
-    <w:bookmarkStart w:id="46" w:name="技术方案"/>
     <w:p>
       <w:pPr>
         <w:pStyle w:val="Heading3"/>
@@ -3115,17 +2955,6 @@
       </w:r>
     </w:p>
     <w:p>
-      <w:r>
-        <w:pict>
-          <v:rect style="width:0;height:1.5pt" o:hralign="center" o:hrstd="t" o:hr="t"/>
-        </w:pict>
-      </w:r>
-    </w:p>
-    <w:bookmarkEnd w:id="46"/>
-    <w:bookmarkEnd w:id="47"/>
-    <w:bookmarkEnd w:id="48"/>
-    <w:bookmarkStart w:id="53" w:name="part-4-实践练习"/>
-    <w:p>
       <w:pPr>
         <w:pStyle w:val="Heading1"/>
       </w:pPr>
@@ -3140,14 +2969,6 @@
       </w:r>
     </w:p>
     <w:p>
-      <w:r>
-        <w:pict>
-          <v:rect style="width:0;height:1.5pt" o:hralign="center" o:hrstd="t" o:hr="t"/>
-        </w:pict>
-      </w:r>
-    </w:p>
-    <w:bookmarkStart w:id="49" w:name="创建v2.0功能分支"/>
-    <w:p>
       <w:pPr>
         <w:pStyle w:val="Heading2"/>
       </w:pPr>
@@ -3278,15 +3099,6 @@
       </w:r>
     </w:p>
     <w:p>
-      <w:r>
-        <w:pict>
-          <v:rect style="width:0;height:1.5pt" o:hralign="center" o:hrstd="t" o:hr="t"/>
-        </w:pict>
-      </w:r>
-    </w:p>
-    <w:bookmarkEnd w:id="49"/>
-    <w:bookmarkStart w:id="51" w:name="编写功能设计文档"/>
-    <w:p>
       <w:pPr>
         <w:pStyle w:val="Heading2"/>
       </w:pPr>
@@ -3300,7 +3112,6 @@
         <w:t xml:space="preserve">编写功能设计文档</w:t>
       </w:r>
     </w:p>
-    <w:bookmarkStart w:id="50" w:name="设计文档模板"/>
     <w:p>
       <w:pPr>
         <w:pStyle w:val="Heading3"/>
@@ -3608,9 +3419,6 @@
         <w:t xml:space="preserve">}</w:t>
       </w:r>
     </w:p>
-    <w:bookmarkEnd w:id="50"/>
-    <w:bookmarkEnd w:id="51"/>
-    <w:bookmarkStart w:id="52" w:name="测试计划"/>
     <w:p>
       <w:pPr>
         <w:pStyle w:val="Heading2"/>
@@ -3659,16 +3467,6 @@
       </w:r>
     </w:p>
     <w:p>
-      <w:r>
-        <w:pict>
-          <v:rect style="width:0;height:1.5pt" o:hralign="center" o:hrstd="t" o:hr="t"/>
-        </w:pict>
-      </w:r>
-    </w:p>
-    <w:bookmarkEnd w:id="52"/>
-    <w:bookmarkEnd w:id="53"/>
-    <w:bookmarkStart w:id="57" w:name="核心知识点总结"/>
-    <w:p>
       <w:pPr>
         <w:pStyle w:val="Heading1"/>
       </w:pPr>
@@ -3679,14 +3477,6 @@
         <w:t xml:space="preserve">核心知识点总结</w:t>
       </w:r>
     </w:p>
-    <w:p>
-      <w:r>
-        <w:pict>
-          <v:rect style="width:0;height:1.5pt" o:hralign="center" o:hrstd="t" o:hr="t"/>
-        </w:pict>
-      </w:r>
-    </w:p>
-    <w:bookmarkStart w:id="54" w:name="pr工作流"/>
     <w:p>
       <w:pPr>
         <w:pStyle w:val="Heading2"/>
@@ -3794,8 +3584,6 @@
         <w:t xml:space="preserve">合并</w:t>
       </w:r>
     </w:p>
-    <w:bookmarkEnd w:id="54"/>
-    <w:bookmarkStart w:id="55" w:name="项目成熟度评估"/>
     <w:p>
       <w:pPr>
         <w:pStyle w:val="Heading2"/>
@@ -3876,8 +3664,6 @@
         <w:t xml:space="preserve">：多维度评估、制定改进计划</w:t>
       </w:r>
     </w:p>
-    <w:bookmarkEnd w:id="55"/>
-    <w:bookmarkStart w:id="56" w:name="v2.0功能规划"/>
     <w:p>
       <w:pPr>
         <w:pStyle w:val="Heading2"/>
@@ -3944,16 +3730,6 @@
       </w:r>
     </w:p>
     <w:p>
-      <w:r>
-        <w:pict>
-          <v:rect style="width:0;height:1.5pt" o:hralign="center" o:hrstd="t" o:hr="t"/>
-        </w:pict>
-      </w:r>
-    </w:p>
-    <w:bookmarkEnd w:id="56"/>
-    <w:bookmarkEnd w:id="57"/>
-    <w:bookmarkStart w:id="60" w:name="课后作业"/>
-    <w:p>
       <w:pPr>
         <w:pStyle w:val="Heading1"/>
       </w:pPr>
@@ -3965,14 +3741,6 @@
       </w:r>
     </w:p>
     <w:p>
-      <w:r>
-        <w:pict>
-          <v:rect style="width:0;height:1.5pt" o:hralign="center" o:hrstd="t" o:hr="t"/>
-        </w:pict>
-      </w:r>
-    </w:p>
-    <w:bookmarkStart w:id="58" w:name="任务"/>
-    <w:p>
       <w:pPr>
         <w:pStyle w:val="Heading2"/>
       </w:pPr>
@@ -4028,8 +3796,6 @@
         <w:t xml:space="preserve">提交PR进行审核</w:t>
       </w:r>
     </w:p>
-    <w:bookmarkEnd w:id="58"/>
-    <w:bookmarkStart w:id="59" w:name="预习"/>
     <w:p>
       <w:pPr>
         <w:pStyle w:val="Heading2"/>
@@ -4072,16 +3838,6 @@
       </w:r>
     </w:p>
     <w:p>
-      <w:r>
-        <w:pict>
-          <v:rect style="width:0;height:1.5pt" o:hralign="center" o:hrstd="t" o:hr="t"/>
-        </w:pict>
-      </w:r>
-    </w:p>
-    <w:bookmarkEnd w:id="59"/>
-    <w:bookmarkEnd w:id="60"/>
-    <w:bookmarkStart w:id="62" w:name="谢谢"/>
-    <w:p>
       <w:pPr>
         <w:pStyle w:val="Heading1"/>
       </w:pPr>
@@ -4092,7 +3848,6 @@
         <w:t xml:space="preserve">谢谢！</w:t>
       </w:r>
     </w:p>
-    <w:bookmarkStart w:id="61" w:name="下节课cicd与openclaw自动化"/>
     <w:p>
       <w:pPr>
         <w:pStyle w:val="Heading2"/>
@@ -4104,8 +3859,6 @@
         <w:t xml:space="preserve">下节课：CI/CD与OpenClaw自动化</w:t>
       </w:r>
     </w:p>
-    <w:bookmarkEnd w:id="61"/>
-    <w:bookmarkEnd w:id="62"/>
     <w:sectPr>
       <w:footnotePr>
         <w:numRestart w:val="eachSect"/>

</xml_diff>